<commit_message>
v1.2.2: manuscript v5 (Blanco 2026 cited), version labels
</commit_message>
<xml_diff>
--- a/manuscripts/Gale_RSM_ResearchInBrief.docx
+++ b/manuscripts/Gale_RSM_ResearchInBrief.docx
@@ -380,7 +380,7 @@
           <w:sz w:val="22"/>
           <w:szCs w:val="22"/>
         </w:rPr>
-        <w:t xml:space="preserve">Work on large language models in evidence synthesis has run them inside the review workflow and asked whether they are accurate enough, measured against a human reference standard, to assist or replace a reviewer.³ We inverted this. What is described here is a test rather than a workflow step: it is automated, and it is run after the fact against a completed and archived analysis, where no reference standard exists and none can be constructed without doing the original extraction again. Its nearest analogues are the automated consistency checkers applied post hoc to published papers, not the model-assisted screening and extraction literature.</w:t>
+        <w:t xml:space="preserve">Work on large language models in evidence synthesis has run them inside the review workflow and asked whether they are accurate enough, measured against a human reference standard, to assist or replace a reviewer.³ That reference standard is itself fallible: in a recent journal-based trial that scored reporting completeness with both a language model and human assessors, a third assessor adjudicating their disagreements against the manuscript sided with the model more often than with the human, and in about one case in nine with neither.⁴ We inverted the design. What is described here is a test rather than a workflow step: it is automated, and it is run after the fact against a completed and archived analysis, where no reference standard exists and none can be constructed without doing the original extraction again. Its nearest analogues are the automated consistency checkers applied post hoc to published papers, not the model-assisted screening and extraction literature.</w:t>
       </w:r>
     </w:p>
     <w:p>
@@ -449,7 +449,7 @@
           <w:sz w:val="22"/>
           <w:szCs w:val="22"/>
         </w:rPr>
-        <w:t xml:space="preserve">The substrate was deliberately unpromising: the benzodiazepine-versus-pregabalin comparison from an abandoned Cochrane review of benzodiazepines in generalised anxiety disorder. The protocol was published in 2012,⁴ the project file was last modified in November 2014, and the protocol was withdrawn at the authors' request in March 2019.⁵ Three industry-sponsored non-inferiority trials met eligibility. The clinical question is settled and the dataset carries no clinical weight; it was chosen for that reason.</w:t>
+        <w:t xml:space="preserve">The substrate was deliberately unpromising: the benzodiazepine-versus-pregabalin comparison from an abandoned Cochrane review of benzodiazepines in generalised anxiety disorder. The protocol was published in 2012,⁵ the project file was last modified in November 2014, and the protocol was withdrawn at the authors' request in March 2019.⁶ Three industry-sponsored non-inferiority trials met eligibility. The clinical question is settled and the dataset carries no clinical weight; it was chosen for that reason.</w:t>
       </w:r>
     </w:p>
     <w:p>
@@ -467,7 +467,7 @@
           <w:sz w:val="22"/>
           <w:szCs w:val="22"/>
         </w:rPr>
-        <w:t xml:space="preserve">A standard deviation of 0.8, recorded identically for all three pregabalin dose arms of the largest trial,⁶ had looked implausible for an anxiety-rating change score during extraction, and the analysis the panel received carried a provisional correction (SD = SE × √n) marked as unverified. Two models flagged that correction as unverified, Qwen3-235B in four of its five returned reviews and DeepSeek-R1 in two, one noting that if 0.8 were in fact correct the corrected analysis was invalid. Source verification, undertaken in response, established that the trial's tables report least-squares means with standard errors from an ANCOVA model, and state so in a footnote. The stored value is a model-derived standard error, not a standard deviation, and the provisional correction was itself wrong: because ANCOVA standard errors partial out baseline covariance, SE × √n underestimates the raw dispersion, and the raw standard deviations are not recoverable from the published tables. The continuous anxiety-rating outcome is therefore not poolable, and was removed rather than reported with a spuriously precise interval.</w:t>
+        <w:t xml:space="preserve">A standard deviation of 0.8, recorded identically for all three pregabalin dose arms of the largest trial,⁷ had looked implausible for an anxiety-rating change score during extraction, and the analysis the panel received carried a provisional correction (SD = SE × √n) marked as unverified. Two models flagged that correction as unverified, Qwen3-235B in four of its five returned reviews and DeepSeek-R1 in two, one noting that if 0.8 were in fact correct the corrected analysis was invalid. Source verification, undertaken in response, established that the trial's tables report least-squares means with standard errors from an ANCOVA model, and state so in a footnote. The stored value is a model-derived standard error, not a standard deviation, and the provisional correction was itself wrong: because ANCOVA standard errors partial out baseline covariance, SE × √n underestimates the raw dispersion, and the raw standard deviations are not recoverable from the published tables. The continuous anxiety-rating outcome is therefore not poolable, and was removed rather than reported with a spuriously precise interval.</w:t>
       </w:r>
     </w:p>
     <w:p>
@@ -1156,7 +1156,7 @@
           <w:sz w:val="22"/>
           <w:szCs w:val="22"/>
         </w:rPr>
-        <w:t xml:space="preserve">The panel also converged on two statistical points — interpretation of τ² and I² at k = 3,⁷ and the absence of a small-sample variance correction in the cluster-robust analysis.⁸ We read convergence as corroboration rather than independent confirmation. Agreement across models indicates shared priors, which is the opposite of the property being exploited here, and models are unreliable auditors of work that matches their own priors.⁹,¹⁰ Divergence widens coverage; convergence raises confidence; the two are not the same and should not be reported as though they were.</w:t>
+        <w:t xml:space="preserve">The panel also converged on two statistical points — interpretation of τ² and I² at k = 3,⁸ and the absence of a small-sample variance correction in the cluster-robust analysis.⁹ We read convergence as corroboration rather than independent confirmation. Agreement across models indicates shared priors, which is the opposite of the property being exploited here, and models are unreliable auditors of work that matches their own priors.¹⁰,¹¹ Divergence widens coverage; convergence raises confidence; the two are not the same and should not be reported as though they were.</w:t>
       </w:r>
     </w:p>
     <w:p>
@@ -1243,7 +1243,7 @@
           <w:sz w:val="22"/>
           <w:szCs w:val="22"/>
         </w:rPr>
-        <w:t xml:space="preserve">This report describes a test and one application of it rather than an evaluation of the test's performance, and is reported as such:¹¹ no accuracy, sensitivity or agreement metrics are claimed, because the comparison that would generate them does not exist for archived data. The obvious next study is a characterisation rather than a demonstration — a published meta-analysis whose hand extraction is a matter of record, re-extracted blind, with concordance reported per field and the pooled estimate recomputed under each disagreement. That design yields the rate this one cannot.</w:t>
+        <w:t xml:space="preserve">This report describes a test and one application of it rather than an evaluation of the test's performance, and is reported as such:¹² no accuracy, sensitivity or agreement metrics are claimed, because the comparison that would generate them does not exist for archived data. The obvious next study is a characterisation rather than a demonstration — a published meta-analysis whose hand extraction is a matter of record, re-extracted blind, with concordance reported per field and the pooled estimate recomputed under each disagreement. That design yields the rate this one cannot.</w:t>
       </w:r>
     </w:p>
     <w:p>
@@ -1378,7 +1378,7 @@
           <w:sz w:val="22"/>
           <w:szCs w:val="22"/>
         </w:rPr>
-        <w:t xml:space="preserve">The source RevMan 5 project file, analysis code, review prompt, orchestration script, model versions and access dates, and the unedited outputs of the open-weight panel and both Gemini cold reads are archived at Zenodo (doi:10.5281/zenodo.[NEW VERSION]; concept DOI 10.5281/zenodo.21252858, resolving to the current version), with the source repository on GitHub. The Grok cold read was run interactively and could not be recovered; this gap is documented in the archive. The archive also contains the original, longer reference version of this work, from which this report was condensed and revised for publication. Code is released under the MIT licence; data and model outputs under CC-BY.</w:t>
+        <w:t xml:space="preserve">The source RevMan 5 project file, analysis code, review prompt, orchestration script, model versions and access dates, and the unedited outputs of the open-weight panel and both Gemini cold reads are archived at Zenodo (doi:10.5281/zenodo.[v1.2.2 DOI]; concept DOI 10.5281/zenodo.21252858, resolving to the current version), with the source repository on GitHub. The Grok cold read was run interactively and could not be recovered; this gap is documented in the archive. The archive also contains the original, longer reference version of this work, from which this report was condensed and revised for publication. Code is released under the MIT licence; data and model outputs under CC-BY.</w:t>
       </w:r>
     </w:p>
     <w:p>
@@ -1529,7 +1529,7 @@
           <w:sz w:val="20"/>
           <w:szCs w:val="20"/>
         </w:rPr>
-        <w:t xml:space="preserve">4. Gale C, Herbison GP, Glue P, Coverdale J, Guaiana G. Benzodiazepines for generalised anxiety disorder (GAD) (Protocol). </w:t>
+        <w:t xml:space="preserve">4. Blanco D, Chen D, Cadellans-Arróniz A, et al. Effectiveness of a structured template to improve completeness of reporting randomised trial protocols: randomised controlled trial. </w:t>
       </w:r>
       <w:r>
         <w:rPr>
@@ -1539,15 +1539,15 @@
           <w:i/>
           <w:iCs/>
         </w:rPr>
-        <w:t xml:space="preserve">Cochrane Database Syst Rev</w:t>
-      </w:r>
-      <w:r>
-        <w:rPr>
-          <w:rFonts w:ascii="Times New Roman" w:cs="Times New Roman" w:eastAsia="Times New Roman" w:hAnsi="Times New Roman"/>
-          <w:sz w:val="20"/>
-          <w:szCs w:val="20"/>
-        </w:rPr>
-        <w:t xml:space="preserve">. 2012;(11):CD001846.</w:t>
+        <w:t xml:space="preserve">BMJ</w:t>
+      </w:r>
+      <w:r>
+        <w:rPr>
+          <w:rFonts w:ascii="Times New Roman" w:cs="Times New Roman" w:eastAsia="Times New Roman" w:hAnsi="Times New Roman"/>
+          <w:sz w:val="20"/>
+          <w:szCs w:val="20"/>
+        </w:rPr>
+        <w:t xml:space="preserve">. 2026;395:e100917. doi:10.1136/bmj-2026-100917</w:t>
       </w:r>
     </w:p>
     <w:p>
@@ -1560,7 +1560,7 @@
           <w:sz w:val="20"/>
           <w:szCs w:val="20"/>
         </w:rPr>
-        <w:t xml:space="preserve">5. Gale C, Herbison GP, Glue P, Coverdale J, Guaiana G. Benzodiazepines for generalised anxiety disorder (GAD) [withdrawn]. </w:t>
+        <w:t xml:space="preserve">5. Gale C, Herbison GP, Glue P, Coverdale J, Guaiana G. Benzodiazepines for generalised anxiety disorder (GAD) (Protocol). </w:t>
       </w:r>
       <w:r>
         <w:rPr>
@@ -1578,7 +1578,7 @@
           <w:sz w:val="20"/>
           <w:szCs w:val="20"/>
         </w:rPr>
-        <w:t xml:space="preserve">. 2019;(4):CD001846.</w:t>
+        <w:t xml:space="preserve">. 2012;(11):CD001846.</w:t>
       </w:r>
     </w:p>
     <w:p>
@@ -1591,7 +1591,7 @@
           <w:sz w:val="20"/>
           <w:szCs w:val="20"/>
         </w:rPr>
-        <w:t xml:space="preserve">6. Rickels K, Pollack MH, Feltner DE, et al. Pregabalin for treatment of generalized anxiety disorder: a 4-week, multicenter, double-blind, placebo-controlled trial of pregabalin and alprazolam. </w:t>
+        <w:t xml:space="preserve">6. Gale C, Herbison GP, Glue P, Coverdale J, Guaiana G. Benzodiazepines for generalised anxiety disorder (GAD) [withdrawn]. </w:t>
       </w:r>
       <w:r>
         <w:rPr>
@@ -1601,15 +1601,15 @@
           <w:i/>
           <w:iCs/>
         </w:rPr>
-        <w:t xml:space="preserve">Arch Gen Psychiatry</w:t>
-      </w:r>
-      <w:r>
-        <w:rPr>
-          <w:rFonts w:ascii="Times New Roman" w:cs="Times New Roman" w:eastAsia="Times New Roman" w:hAnsi="Times New Roman"/>
-          <w:sz w:val="20"/>
-          <w:szCs w:val="20"/>
-        </w:rPr>
-        <w:t xml:space="preserve">. 2005;62(9):1022-1030.</w:t>
+        <w:t xml:space="preserve">Cochrane Database Syst Rev</w:t>
+      </w:r>
+      <w:r>
+        <w:rPr>
+          <w:rFonts w:ascii="Times New Roman" w:cs="Times New Roman" w:eastAsia="Times New Roman" w:hAnsi="Times New Roman"/>
+          <w:sz w:val="20"/>
+          <w:szCs w:val="20"/>
+        </w:rPr>
+        <w:t xml:space="preserve">. 2019;(4):CD001846.</w:t>
       </w:r>
     </w:p>
     <w:p>
@@ -1622,7 +1622,7 @@
           <w:sz w:val="20"/>
           <w:szCs w:val="20"/>
         </w:rPr>
-        <w:t xml:space="preserve">7. Higgins JPT, Thomas J, Chandler J, et al, eds. </w:t>
+        <w:t xml:space="preserve">7. Rickels K, Pollack MH, Feltner DE, et al. Pregabalin for treatment of generalized anxiety disorder: a 4-week, multicenter, double-blind, placebo-controlled trial of pregabalin and alprazolam. </w:t>
       </w:r>
       <w:r>
         <w:rPr>
@@ -1632,15 +1632,15 @@
           <w:i/>
           <w:iCs/>
         </w:rPr>
-        <w:t xml:space="preserve">Cochrane Handbook for Systematic Reviews of Interventions</w:t>
-      </w:r>
-      <w:r>
-        <w:rPr>
-          <w:rFonts w:ascii="Times New Roman" w:cs="Times New Roman" w:eastAsia="Times New Roman" w:hAnsi="Times New Roman"/>
-          <w:sz w:val="20"/>
-          <w:szCs w:val="20"/>
-        </w:rPr>
-        <w:t xml:space="preserve">. Version 6.4. Cochrane; 2023.</w:t>
+        <w:t xml:space="preserve">Arch Gen Psychiatry</w:t>
+      </w:r>
+      <w:r>
+        <w:rPr>
+          <w:rFonts w:ascii="Times New Roman" w:cs="Times New Roman" w:eastAsia="Times New Roman" w:hAnsi="Times New Roman"/>
+          <w:sz w:val="20"/>
+          <w:szCs w:val="20"/>
+        </w:rPr>
+        <w:t xml:space="preserve">. 2005;62(9):1022-1030.</w:t>
       </w:r>
     </w:p>
     <w:p>
@@ -1653,7 +1653,7 @@
           <w:sz w:val="20"/>
           <w:szCs w:val="20"/>
         </w:rPr>
-        <w:t xml:space="preserve">8. Pustejovsky JE, Tipton E. Meta-analysis with robust variance estimation: expanding the range of working models. </w:t>
+        <w:t xml:space="preserve">8. Higgins JPT, Thomas J, Chandler J, et al, eds. </w:t>
       </w:r>
       <w:r>
         <w:rPr>
@@ -1663,15 +1663,15 @@
           <w:i/>
           <w:iCs/>
         </w:rPr>
-        <w:t xml:space="preserve">Prev Sci</w:t>
-      </w:r>
-      <w:r>
-        <w:rPr>
-          <w:rFonts w:ascii="Times New Roman" w:cs="Times New Roman" w:eastAsia="Times New Roman" w:hAnsi="Times New Roman"/>
-          <w:sz w:val="20"/>
-          <w:szCs w:val="20"/>
-        </w:rPr>
-        <w:t xml:space="preserve">. 2022;23(3):425-438.</w:t>
+        <w:t xml:space="preserve">Cochrane Handbook for Systematic Reviews of Interventions</w:t>
+      </w:r>
+      <w:r>
+        <w:rPr>
+          <w:rFonts w:ascii="Times New Roman" w:cs="Times New Roman" w:eastAsia="Times New Roman" w:hAnsi="Times New Roman"/>
+          <w:sz w:val="20"/>
+          <w:szCs w:val="20"/>
+        </w:rPr>
+        <w:t xml:space="preserve">. Version 6.4. Cochrane; 2023.</w:t>
       </w:r>
     </w:p>
     <w:p>
@@ -1684,7 +1684,7 @@
           <w:sz w:val="20"/>
           <w:szCs w:val="20"/>
         </w:rPr>
-        <w:t xml:space="preserve">9. Kamoi R, Zhang Y, Zhang N, Han J, Zhang R. When can LLMs actually correct their own mistakes? A critical survey of self-correction of LLMs. </w:t>
+        <w:t xml:space="preserve">9. Pustejovsky JE, Tipton E. Meta-analysis with robust variance estimation: expanding the range of working models. </w:t>
       </w:r>
       <w:r>
         <w:rPr>
@@ -1694,6 +1694,37 @@
           <w:i/>
           <w:iCs/>
         </w:rPr>
+        <w:t xml:space="preserve">Prev Sci</w:t>
+      </w:r>
+      <w:r>
+        <w:rPr>
+          <w:rFonts w:ascii="Times New Roman" w:cs="Times New Roman" w:eastAsia="Times New Roman" w:hAnsi="Times New Roman"/>
+          <w:sz w:val="20"/>
+          <w:szCs w:val="20"/>
+        </w:rPr>
+        <w:t xml:space="preserve">. 2022;23(3):425-438.</w:t>
+      </w:r>
+    </w:p>
+    <w:p>
+      <w:pPr>
+        <w:spacing w:after="90" w:line="300"/>
+      </w:pPr>
+      <w:r>
+        <w:rPr>
+          <w:rFonts w:ascii="Times New Roman" w:cs="Times New Roman" w:eastAsia="Times New Roman" w:hAnsi="Times New Roman"/>
+          <w:sz w:val="20"/>
+          <w:szCs w:val="20"/>
+        </w:rPr>
+        <w:t xml:space="preserve">10. Kamoi R, Zhang Y, Zhang N, Han J, Zhang R. When can LLMs actually correct their own mistakes? A critical survey of self-correction of LLMs. </w:t>
+      </w:r>
+      <w:r>
+        <w:rPr>
+          <w:rFonts w:ascii="Times New Roman" w:cs="Times New Roman" w:eastAsia="Times New Roman" w:hAnsi="Times New Roman"/>
+          <w:sz w:val="20"/>
+          <w:szCs w:val="20"/>
+          <w:i/>
+          <w:iCs/>
+        </w:rPr>
         <w:t xml:space="preserve">Trans Assoc Comput Linguist</w:t>
       </w:r>
       <w:r>
@@ -1715,7 +1746,7 @@
           <w:sz w:val="20"/>
           <w:szCs w:val="20"/>
         </w:rPr>
-        <w:t xml:space="preserve">10. Huang J, Chen X, Mishra S, et al. Large language models cannot self-correct reasoning yet. Paper presented at: Twelfth International Conference on Learning Representations; May 7-11, 2024; Vienna, Austria.</w:t>
+        <w:t xml:space="preserve">11. Huang J, Chen X, Mishra S, et al. Large language models cannot self-correct reasoning yet. Paper presented at: Twelfth International Conference on Learning Representations; May 7-11, 2024; Vienna, Austria.</w:t>
       </w:r>
     </w:p>
     <w:p>
@@ -1728,7 +1759,7 @@
           <w:sz w:val="20"/>
           <w:szCs w:val="20"/>
         </w:rPr>
-        <w:t xml:space="preserve">11. Farotimi O, Dunn A, Van Lissa CJ, Polanin JR, Mavridis D, Pigott TD. Guidance for manuscript submissions testing the use of generative AI for systematic review and meta-analysis. </w:t>
+        <w:t xml:space="preserve">12. Farotimi O, Dunn A, Van Lissa CJ, Polanin JR, Mavridis D, Pigott TD. Guidance for manuscript submissions testing the use of generative AI for systematic review and meta-analysis. </w:t>
       </w:r>
       <w:r>
         <w:rPr>

</xml_diff>